<commit_message>
Synchronizuj formularze CIS ze wzorami zrodlowymi
</commit_message>
<xml_diff>
--- a/public/wzory/CIS_B-05_Karta_monitoringu_ISR_z_opinia_koncowa.docx
+++ b/public/wzory/CIS_B-05_Karta_monitoringu_ISR_z_opinia_koncowa.docx
@@ -98,6 +98,7 @@
           <w:insideH w:val="single" w:color="auto" w:sz="4"/>
           <w:insideV w:val="single" w:color="auto" w:sz="4"/>
         </w:tblBorders>
+        <w:tblLayout w:type="fixed"/>
       </w:tblPr>
       <w:tblGrid>
         <w:gridCol w:w="3300"/>
@@ -342,6 +343,7 @@
           <w:insideH w:val="single" w:color="auto" w:sz="4"/>
           <w:insideV w:val="single" w:color="auto" w:sz="4"/>
         </w:tblBorders>
+        <w:tblLayout w:type="fixed"/>
       </w:tblPr>
       <w:tblGrid>
         <w:gridCol w:w="1300"/>
@@ -1605,6 +1607,7 @@
           <w:insideH w:val="single" w:color="auto" w:sz="4"/>
           <w:insideV w:val="single" w:color="auto" w:sz="4"/>
         </w:tblBorders>
+        <w:tblLayout w:type="fixed"/>
       </w:tblPr>
       <w:tblGrid>
         <w:gridCol w:w="1300"/>
@@ -2178,6 +2181,7 @@
           <w:insideH w:val="single" w:color="auto" w:sz="4"/>
           <w:insideV w:val="single" w:color="auto" w:sz="4"/>
         </w:tblBorders>
+        <w:tblLayout w:type="fixed"/>
       </w:tblPr>
       <w:tblGrid>
         <w:gridCol w:w="4536"/>

</xml_diff>